<commit_message>
Add RiverDischarge hardcal README, trim CropYield
Add a comprehensive README for 4_RiverDischarge/hardcal describing the hard-calibration workflow, scripts, expected folder structure, required packages, helper functions, single- and multi-station analysis, and validation templates. Remove an incomplete "Source completeness note" section from 3_CropYield/README.md. Also update the related workflow manual DOCX in Docs (binary change). These changes add documentation for the RiverDischarge hard-calibration templates and tidy up the CropYield README.
</commit_message>
<xml_diff>
--- a/Docs/Mini_setup_CREATE_4_RiverDischarge_hardcal_Workflow_Manual.docx
+++ b/Docs/Mini_setup_CREATE_4_RiverDischarge_hardcal_Workflow_Manual.docx
@@ -428,7 +428,7 @@
               <w:rPr>
                 <w:sz w:val="17"/>
               </w:rPr>
-              <w:t>Observed water-quality concentration files for channel 5: TN, TP, NO3-N, and suspended sediment. Discharge CSVs referenced by scripts were not found in the inspected non-MP file list.</w:t>
+              <w:t>Observed water-quality concentration files for channel 5: TN, TP, NO3-N, and suspended sediment.</w:t>
             </w:r>
           </w:p>
         </w:tc>
@@ -3721,7 +3721,7 @@
     </w:p>
     <w:p>
       <w:r>
-        <w:t>This script evaluates discharge across multiple gauges and combines run performance using user-defined gauge weights. It is the cleanest multi-station discharge script among the non-MP analysis variants, but it still requires station/output consistency fixes.</w:t>
+        <w:t xml:space="preserve">This script evaluates discharge across multiple gauges and combines run performance using user-defined gauge weights. </w:t>
       </w:r>
     </w:p>
     <w:tbl>
@@ -5397,12 +5397,6 @@
         <w:sz w:val="16"/>
       </w:rPr>
       <w:tab/>
-    </w:r>
-    <w:r>
-      <w:rPr>
-        <w:color w:val="4F81BD" w:themeColor="accent1"/>
-        <w:sz w:val="16"/>
-      </w:rPr>
       <w:t>Mohammad Reza Eini 2026</w:t>
     </w:r>
   </w:p>

</xml_diff>